<commit_message>
Fixed formating error, started making loading screen
Fixed formatting error caused by invisible whitespace in docx template. Started work on a loading screen, does not work at the moment, will work on it later.
</commit_message>
<xml_diff>
--- a/generated_report.docx
+++ b/generated_report.docx
@@ -143,7 +143,7 @@
             </w:pPr>
             <w:proofErr w:type="gramStart"/>
             <w:r>
-              <w:t xml:space="preserve">3</w:t>
+              <w:t xml:space="preserve"/>
             </w:r>
           </w:p>
           <w:p>
@@ -327,27 +327,21 @@
               </w:rPr>
               <w:t>Installations prévues</w:t>
             </w:r>
-            <w:r>
-              <w:rPr>
-                <w:rFonts w:cs="Arial"/>
-                <w:sz w:val="20"/>
-              </w:rPr>
-              <w:t xml:space="preserve"> :</w:t>
-            </w:r>
-            <w:r>
-              <w:rPr>
-                <w:rFonts w:cs="Arial"/>
-                <w:b/>
-                <w:sz w:val="20"/>
-              </w:rPr>
-              <w:tab/>
-            </w:r>
-            <w:r>
-              <w:rPr>
-                <w:rFonts w:cs="Arial"/>
-                <w:sz w:val="20"/>
-              </w:rPr>
-              <w:t xml:space="preserve">Chapiteau : </w:t>
+            <w:proofErr w:type="gramStart"/>
+            <w:r>
+              <w:rPr>
+                <w:rFonts w:cs="Arial"/>
+                <w:sz w:val="20"/>
+              </w:rPr>
+              <w:t> :Chapiteau</w:t>
+            </w:r>
+            <w:proofErr w:type="gramEnd"/>
+            <w:r>
+              <w:rPr>
+                <w:rFonts w:cs="Arial"/>
+                <w:sz w:val="20"/>
+              </w:rPr>
+              <w:t xml:space="preserve"> : </w:t>
             </w:r>
             <w:r>
               <w:rPr>
@@ -396,14 +390,6 @@
             <w:r>
               <w:rPr>
                 <w:rFonts w:cs="Arial"/>
-                <w:b/>
-                <w:sz w:val="20"/>
-              </w:rPr>
-              <w:tab/>
-            </w:r>
-            <w:r>
-              <w:rPr>
-                <w:rFonts w:cs="Arial"/>
                 <w:sz w:val="20"/>
               </w:rPr>
               <w:t>Tente(s)</w:t>
@@ -413,7 +399,7 @@
                 <w:rFonts w:cs="Arial"/>
                 <w:sz w:val="20"/>
               </w:rPr>
-              <w:t xml:space="preserve"> :</w:t>
+              <w:t> :</w:t>
             </w:r>
             <w:r>
               <w:rPr>
@@ -427,7 +413,7 @@
                 <w:rFonts w:cs="Arial"/>
                 <w:sz w:val="20"/>
               </w:rPr>
-              <w:t xml:space="preserve"> oui </w:t>
+              <w:t xml:space="preserve"> non </w:t>
             </w:r>
             <w:r>
               <w:rPr>
@@ -442,44 +428,6 @@
                 <w:sz w:val="20"/>
               </w:rPr>
               <w:t xml:space="preserve"/>
-            </w:r>
-            <w:r>
-              <w:rPr>
-                <w:rFonts w:cs="Arial"/>
-                <w:sz w:val="20"/>
-              </w:rPr>
-              <w:t>Nomb</w:t>
-            </w:r>
-            <w:r>
-              <w:rPr>
-                <w:rFonts w:cs="Arial"/>
-                <w:sz w:val="20"/>
-              </w:rPr>
-              <w:t xml:space="preserve">re</w:t>
-            </w:r>
-            <w:proofErr w:type="gramEnd"/>
-            <w:r>
-              <w:rPr>
-                <w:rFonts w:cs="Arial"/>
-                <w:sz w:val="20"/>
-              </w:rPr>
-              <w:t xml:space="preserve"> : </w:t>
-            </w:r>
-            <w:proofErr w:type="gramStart"/>
-            <w:r>
-              <w:rPr>
-                <w:rFonts w:cs="Arial"/>
-                <w:sz w:val="20"/>
-              </w:rPr>
-              <w:t xml:space="preserve">3 - Taille : </w:t>
-            </w:r>
-            <w:proofErr w:type="gramStart"/>
-            <w:r>
-              <w:rPr>
-                <w:rFonts w:cs="Arial"/>
-                <w:sz w:val="20"/>
-              </w:rPr>
-              <w:t xml:space="preserve">3 </w:t>
             </w:r>
           </w:p>
           <w:p>
@@ -507,17 +455,9 @@
             <w:r>
               <w:rPr>
                 <w:rFonts w:cs="Arial"/>
-                <w:b/>
-                <w:sz w:val="20"/>
-              </w:rPr>
-              <w:tab/>
-            </w:r>
-            <w:r>
-              <w:rPr>
-                <w:rFonts w:cs="Arial"/>
-                <w:sz w:val="20"/>
-              </w:rPr>
-              <w:t xml:space="preserve">Gradin</w:t>
+                <w:sz w:val="20"/>
+              </w:rPr>
+              <w:t>Gradin</w:t>
             </w:r>
             <w:r>
               <w:rPr>
@@ -632,14 +572,6 @@
             <w:r>
               <w:rPr>
                 <w:rFonts w:cs="Arial"/>
-                <w:b/>
-                <w:sz w:val="20"/>
-              </w:rPr>
-              <w:tab/>
-            </w:r>
-            <w:r>
-              <w:rPr>
-                <w:rFonts w:cs="Arial"/>
                 <w:sz w:val="20"/>
               </w:rPr>
               <w:t>Structures aériennes</w:t>
@@ -671,7 +603,7 @@
                 <w:rFonts w:cs="Arial"/>
                 <w:sz w:val="20"/>
               </w:rPr>
-              <w:t xml:space="preserve">  oui </w:t>
+              <w:t xml:space="preserve">  non </w:t>
             </w:r>
             <w:r>
               <w:rPr>
@@ -771,14 +703,6 @@
             <w:r>
               <w:rPr>
                 <w:rFonts w:cs="Arial"/>
-                <w:b/>
-                <w:sz w:val="20"/>
-              </w:rPr>
-              <w:tab/>
-            </w:r>
-            <w:r>
-              <w:rPr>
-                <w:rFonts w:cs="Arial"/>
                 <w:sz w:val="20"/>
               </w:rPr>
               <w:t>Barbecue</w:t>
@@ -846,7 +770,7 @@
                 <w:rFonts w:cs="Arial"/>
                 <w:sz w:val="20"/>
               </w:rPr>
-              <w:t xml:space="preserve"> oui </w:t>
+              <w:t xml:space="preserve"> non </w:t>
             </w:r>
             <w:r>
               <w:rPr>
@@ -885,21 +809,13 @@
               </w:rPr>
               <w:t>Date :</w:t>
             </w:r>
-            <w:r>
-              <w:rPr>
-                <w:rFonts w:cs="Arial"/>
-                <w:b/>
-                <w:sz w:val="20"/>
-              </w:rPr>
-              <w:tab/>
-            </w:r>
             <w:proofErr w:type="gramStart"/>
             <w:r>
               <w:rPr>
                 <w:rFonts w:cs="Arial"/>
                 <w:sz w:val="20"/>
               </w:rPr>
-              <w:t xml:space="preserve">3333-03-31</w:t>
+              <w:t xml:space="preserve"/>
             </w:r>
           </w:p>
           <w:p>
@@ -930,21 +846,13 @@
               </w:rPr>
               <w:t>Responsable de la manifestation :</w:t>
             </w:r>
-            <w:r>
-              <w:rPr>
-                <w:rFonts w:cs="Arial"/>
-                <w:b/>
-                <w:sz w:val="20"/>
-              </w:rPr>
-              <w:tab/>
-            </w:r>
             <w:proofErr w:type="gramStart"/>
             <w:r>
               <w:rPr>
                 <w:rFonts w:cs="Arial"/>
                 <w:sz w:val="20"/>
               </w:rPr>
-              <w:t xml:space="preserve">33</w:t>
+              <w:t xml:space="preserve"/>
             </w:r>
           </w:p>
           <w:p>
@@ -982,24 +890,15 @@
                 <w:rFonts w:cs="Arial"/>
                 <w:sz w:val="20"/>
               </w:rPr>
-              <w:t xml:space="preserve">):</w:t>
+              <w:t>):</w:t>
             </w:r>
             <w:proofErr w:type="gramEnd"/>
             <w:r>
               <w:rPr>
                 <w:rFonts w:cs="Arial"/>
-                <w:b/>
-                <w:sz w:val="20"/>
-              </w:rPr>
-              <w:tab/>
-            </w:r>
-            <w:proofErr w:type="gramStart"/>
-            <w:r>
-              <w:rPr>
-                <w:rFonts w:cs="Arial"/>
-                <w:sz w:val="20"/>
-              </w:rPr>
-              <w:t xml:space="preserve">33</w:t>
+                <w:sz w:val="20"/>
+              </w:rPr>
+              <w:t xml:space="preserve"/>
             </w:r>
           </w:p>
           <w:p>
@@ -1030,18 +929,9 @@
             <w:r>
               <w:rPr>
                 <w:rFonts w:cs="Arial"/>
-                <w:b/>
-                <w:sz w:val="20"/>
-              </w:rPr>
-              <w:tab/>
-            </w:r>
-            <w:proofErr w:type="gramStart"/>
-            <w:r>
-              <w:rPr>
-                <w:rFonts w:cs="Arial"/>
-                <w:sz w:val="20"/>
-              </w:rPr>
-              <w:t xml:space="preserve">3333-03-31 </w:t>
+                <w:sz w:val="20"/>
+              </w:rPr>
+              <w:t xml:space="preserve"> </w:t>
             </w:r>
             <w:r>
               <w:rPr>
@@ -1050,51 +940,33 @@
               </w:rPr>
               <w:t xml:space="preserve">de </w:t>
             </w:r>
-            <w:proofErr w:type="gramStart"/>
-            <w:r>
-              <w:rPr>
-                <w:rFonts w:cs="Arial"/>
-                <w:sz w:val="20"/>
-              </w:rPr>
-              <w:t xml:space="preserve">03:33</w:t>
-            </w:r>
-            <w:r>
-              <w:rPr>
-                <w:rFonts w:cs="Arial"/>
-                <w:sz w:val="20"/>
-              </w:rPr>
-              <w:t xml:space="preserve">h</w:t>
-            </w:r>
-            <w:proofErr w:type="gramEnd"/>
-            <w:r>
-              <w:rPr>
-                <w:rFonts w:cs="Arial"/>
-                <w:sz w:val="20"/>
-              </w:rPr>
-              <w:t xml:space="preserve">     à </w:t>
-            </w:r>
-            <w:proofErr w:type="gramStart"/>
-            <w:r>
-              <w:rPr>
-                <w:rFonts w:cs="Arial"/>
-                <w:sz w:val="20"/>
-              </w:rPr>
-              <w:t xml:space="preserve">03:33</w:t>
-            </w:r>
-            <w:r>
-              <w:rPr>
-                <w:rFonts w:cs="Arial"/>
-                <w:sz w:val="20"/>
-              </w:rPr>
-              <w:t>h</w:t>
-            </w:r>
-            <w:proofErr w:type="gramEnd"/>
-            <w:r>
-              <w:rPr>
-                <w:rFonts w:cs="Arial"/>
-                <w:sz w:val="20"/>
-              </w:rPr>
-              <w:t xml:space="preserve">      </w:t>
+            <w:r>
+              <w:rPr>
+                <w:rFonts w:cs="Arial"/>
+                <w:sz w:val="20"/>
+              </w:rPr>
+              <w:t xml:space="preserve"/>
+            </w:r>
+            <w:r>
+              <w:rPr>
+                <w:rFonts w:cs="Arial"/>
+                <w:sz w:val="20"/>
+              </w:rPr>
+              <w:t xml:space="preserve">h     à </w:t>
+            </w:r>
+            <w:r>
+              <w:rPr>
+                <w:rFonts w:cs="Arial"/>
+                <w:sz w:val="20"/>
+              </w:rPr>
+              <w:t xml:space="preserve"/>
+            </w:r>
+            <w:r>
+              <w:rPr>
+                <w:rFonts w:cs="Arial"/>
+                <w:sz w:val="20"/>
+              </w:rPr>
+              <w:t xml:space="preserve">h      </w:t>
             </w:r>
           </w:p>
           <w:p>
@@ -1123,23 +995,14 @@
                 <w:rFonts w:cs="Arial"/>
                 <w:sz w:val="20"/>
               </w:rPr>
-              <w:t xml:space="preserve">En compagnie de :</w:t>
-            </w:r>
-            <w:r>
-              <w:rPr>
-                <w:rFonts w:cs="Arial"/>
-                <w:b/>
-                <w:sz w:val="20"/>
-              </w:rPr>
-              <w:tab/>
-            </w:r>
-            <w:proofErr w:type="gramStart"/>
-            <w:r>
-              <w:rPr>
-                <w:rFonts w:cs="Arial"/>
-                <w:sz w:val="20"/>
-              </w:rPr>
-              <w:t xml:space="preserve">33</w:t>
+              <w:t>En compagnie de :</w:t>
+            </w:r>
+            <w:r>
+              <w:rPr>
+                <w:rFonts w:cs="Arial"/>
+                <w:sz w:val="20"/>
+              </w:rPr>
+              <w:t xml:space="preserve"/>
             </w:r>
           </w:p>
           <w:p>
@@ -1168,23 +1031,14 @@
                 <w:rFonts w:cs="Arial"/>
                 <w:sz w:val="20"/>
               </w:rPr>
-              <w:t xml:space="preserve">Adresse de facturation :</w:t>
-            </w:r>
-            <w:r>
-              <w:rPr>
-                <w:rFonts w:cs="Arial"/>
-                <w:b/>
-                <w:sz w:val="20"/>
-              </w:rPr>
-              <w:tab/>
-            </w:r>
-            <w:proofErr w:type="gramStart"/>
-            <w:r>
-              <w:rPr>
-                <w:rFonts w:cs="Arial"/>
-                <w:sz w:val="20"/>
-              </w:rPr>
-              <w:t xml:space="preserve">33</w:t>
+              <w:t>Adresse de facturation :</w:t>
+            </w:r>
+            <w:r>
+              <w:rPr>
+                <w:rFonts w:cs="Arial"/>
+                <w:sz w:val="20"/>
+              </w:rPr>
+              <w:t xml:space="preserve"/>
             </w:r>
           </w:p>
           <w:p>
@@ -1213,7 +1067,7 @@
                 <w:rFonts w:cs="Arial"/>
                 <w:sz w:val="20"/>
               </w:rPr>
-              <w:t xml:space="preserve">E-mail (envoi rapport) :</w:t>
+              <w:t>E-mail (envoi rapport) :</w:t>
             </w:r>
             <w:r>
               <w:rPr>
@@ -1226,18 +1080,9 @@
             <w:r>
               <w:rPr>
                 <w:rFonts w:cs="Arial"/>
-                <w:b/>
-                <w:sz w:val="20"/>
-              </w:rPr>
-              <w:tab/>
-            </w:r>
-            <w:proofErr w:type="gramStart"/>
-            <w:r>
-              <w:rPr>
-                <w:rFonts w:cs="Arial"/>
-                <w:sz w:val="20"/>
-              </w:rPr>
-              <w:t xml:space="preserve">a@a.a</w:t>
+                <w:sz w:val="20"/>
+              </w:rPr>
+              <w:t xml:space="preserve"/>
             </w:r>
           </w:p>
           <w:p>
@@ -1266,30 +1111,14 @@
                 <w:rFonts w:cs="Arial"/>
                 <w:sz w:val="20"/>
               </w:rPr>
-              <w:t xml:space="preserve">Moyens de prévention prévus :</w:t>
-            </w:r>
-            <w:r>
-              <w:rPr>
-                <w:rFonts w:cs="Arial"/>
-                <w:b/>
-                <w:sz w:val="20"/>
-              </w:rPr>
-              <w:tab/>
-            </w:r>
-            <w:r>
-              <w:rPr>
-                <w:rFonts w:cs="Arial"/>
-                <w:sz w:val="20"/>
-              </w:rPr>
-              <w:t xml:space="preserve">Issues : Nombre : </w:t>
-            </w:r>
-            <w:proofErr w:type="gramStart"/>
-            <w:r>
-              <w:rPr>
-                <w:rFonts w:cs="Arial"/>
-                <w:sz w:val="20"/>
-              </w:rPr>
-              <w:t xml:space="preserve">3</w:t>
+              <w:t xml:space="preserve">Moyens de prévention prévus :Issues : Nombre : </w:t>
+            </w:r>
+            <w:r>
+              <w:rPr>
+                <w:rFonts w:cs="Arial"/>
+                <w:sz w:val="20"/>
+              </w:rPr>
+              <w:t xml:space="preserve"/>
             </w:r>
             <w:r>
               <w:rPr>
@@ -1303,7 +1132,7 @@
                 <w:rFonts w:cs="Arial"/>
                 <w:sz w:val="20"/>
               </w:rPr>
-              <w:t xml:space="preserve"> 3</w:t>
+              <w:t xml:space="preserve"> </w:t>
             </w:r>
           </w:p>
           <w:p>
@@ -1330,17 +1159,9 @@
             <w:r>
               <w:rPr>
                 <w:rFonts w:cs="Arial"/>
-                <w:b/>
-                <w:sz w:val="20"/>
-              </w:rPr>
-              <w:tab/>
-            </w:r>
-            <w:r>
-              <w:rPr>
-                <w:rFonts w:cs="Arial"/>
-                <w:sz w:val="20"/>
-              </w:rPr>
-              <w:t xml:space="preserve">Extincteurs(s)</w:t>
+                <w:sz w:val="20"/>
+              </w:rPr>
+              <w:t>Extincteurs(s)</w:t>
             </w:r>
             <w:r>
               <w:rPr>
@@ -1388,41 +1209,16 @@
             <w:r>
               <w:rPr>
                 <w:rFonts w:cs="Arial"/>
-                <w:b/>
-                <w:sz w:val="20"/>
-              </w:rPr>
-              <w:tab/>
-            </w:r>
-            <w:proofErr w:type="spellStart"/>
-            <w:r>
-              <w:rPr>
-                <w:rFonts w:cs="Arial"/>
-                <w:sz w:val="20"/>
-              </w:rPr>
-              <w:t>Eclairage</w:t>
-            </w:r>
-            <w:proofErr w:type="spellEnd"/>
-            <w:r>
-              <w:rPr>
-                <w:rFonts w:cs="Arial"/>
-                <w:sz w:val="20"/>
-              </w:rPr>
-              <w:t xml:space="preserve"> de sécurité</w:t>
-            </w:r>
-            <w:r>
-              <w:rPr>
-                <w:rFonts w:cs="Arial"/>
-                <w:sz w:val="20"/>
-              </w:rPr>
-              <w:t> </w:t>
-            </w:r>
-            <w:proofErr w:type="gramStart"/>
-            <w:r>
-              <w:rPr>
-                <w:rFonts w:cs="Arial"/>
-                <w:sz w:val="20"/>
-              </w:rPr>
-              <w:t>:</w:t>
+                <w:sz w:val="20"/>
+              </w:rPr>
+              <w:t>Eclairage de sécurité</w:t>
+            </w:r>
+            <w:r>
+              <w:rPr>
+                <w:rFonts w:cs="Arial"/>
+                <w:sz w:val="20"/>
+              </w:rPr>
+              <w:t> :</w:t>
             </w:r>
             <w:r>
               <w:rPr>
@@ -1436,7 +1232,7 @@
                 <w:rFonts w:cs="Arial"/>
                 <w:sz w:val="20"/>
               </w:rPr>
-              <w:t xml:space="preserve"> oui </w:t>
+              <w:t xml:space="preserve"> non </w:t>
             </w:r>
           </w:p>
           <w:p>
@@ -1463,14 +1259,6 @@
             <w:r>
               <w:rPr>
                 <w:rFonts w:cs="Arial"/>
-                <w:b/>
-                <w:sz w:val="20"/>
-              </w:rPr>
-              <w:tab/>
-            </w:r>
-            <w:r>
-              <w:rPr>
-                <w:rFonts w:cs="Arial"/>
                 <w:sz w:val="20"/>
               </w:rPr>
               <w:t>Pictogrammes d’évacuation</w:t>
@@ -1480,15 +1268,7 @@
                 <w:rFonts w:cs="Arial"/>
                 <w:sz w:val="20"/>
               </w:rPr>
-              <w:t> </w:t>
-            </w:r>
-            <w:proofErr w:type="gramStart"/>
-            <w:r>
-              <w:rPr>
-                <w:rFonts w:cs="Arial"/>
-                <w:sz w:val="20"/>
-              </w:rPr>
-              <w:t>:</w:t>
+              <w:t> :</w:t>
             </w:r>
             <w:r>
               <w:rPr>
@@ -1545,14 +1325,6 @@
             <w:r>
               <w:rPr>
                 <w:rFonts w:cs="Arial"/>
-                <w:b/>
-                <w:sz w:val="20"/>
-              </w:rPr>
-              <w:tab/>
-            </w:r>
-            <w:r>
-              <w:rPr>
-                <w:rFonts w:cs="Arial"/>
                 <w:sz w:val="20"/>
               </w:rPr>
               <w:t>PV de classement des toiles</w:t>
@@ -1562,15 +1334,7 @@
                 <w:rFonts w:cs="Arial"/>
                 <w:sz w:val="20"/>
               </w:rPr>
-              <w:t> </w:t>
-            </w:r>
-            <w:proofErr w:type="gramStart"/>
-            <w:r>
-              <w:rPr>
-                <w:rFonts w:cs="Arial"/>
-                <w:sz w:val="20"/>
-              </w:rPr>
-              <w:t>:</w:t>
+              <w:t> :</w:t>
             </w:r>
             <w:r>
               <w:rPr>
@@ -1611,14 +1375,6 @@
             <w:r>
               <w:rPr>
                 <w:rFonts w:cs="Arial"/>
-                <w:b/>
-                <w:sz w:val="20"/>
-              </w:rPr>
-              <w:tab/>
-            </w:r>
-            <w:r>
-              <w:rPr>
-                <w:rFonts w:cs="Arial"/>
                 <w:sz w:val="20"/>
               </w:rPr>
               <w:t>PV de contrôle installation électrique</w:t>
@@ -1628,15 +1384,7 @@
                 <w:rFonts w:cs="Arial"/>
                 <w:sz w:val="20"/>
               </w:rPr>
-              <w:t> </w:t>
-            </w:r>
-            <w:proofErr w:type="gramStart"/>
-            <w:r>
-              <w:rPr>
-                <w:rFonts w:cs="Arial"/>
-                <w:sz w:val="20"/>
-              </w:rPr>
-              <w:t>:</w:t>
+              <w:t> :</w:t>
             </w:r>
             <w:r>
               <w:rPr>
@@ -1650,7 +1398,7 @@
                 <w:rFonts w:cs="Arial"/>
                 <w:sz w:val="20"/>
               </w:rPr>
-              <w:t xml:space="preserve"> oui </w:t>
+              <w:t xml:space="preserve"> non </w:t>
             </w:r>
           </w:p>
           <w:p>
@@ -1677,14 +1425,6 @@
             <w:r>
               <w:rPr>
                 <w:rFonts w:cs="Arial"/>
-                <w:b/>
-                <w:sz w:val="20"/>
-              </w:rPr>
-              <w:tab/>
-            </w:r>
-            <w:r>
-              <w:rPr>
-                <w:rFonts w:cs="Arial"/>
                 <w:sz w:val="20"/>
               </w:rPr>
               <w:t>PV de contrôle stabilité structures</w:t>
@@ -1694,15 +1434,7 @@
                 <w:rFonts w:cs="Arial"/>
                 <w:sz w:val="20"/>
               </w:rPr>
-              <w:t> </w:t>
-            </w:r>
-            <w:proofErr w:type="gramStart"/>
-            <w:r>
-              <w:rPr>
-                <w:rFonts w:cs="Arial"/>
-                <w:sz w:val="20"/>
-              </w:rPr>
-              <w:t>:</w:t>
+              <w:t> :</w:t>
             </w:r>
             <w:r>
               <w:rPr>
@@ -1777,7 +1509,7 @@
           <w:sz w:val="28"/>
           <w:szCs w:val="32"/>
         </w:rPr>
-        <w:t xml:space="preserve">PRESCRIPTIONS :</w:t>
+        <w:t>PRESCRIPTIONS :</w:t>
       </w:r>
     </w:p>
     <w:p>
@@ -1820,51 +1552,6 @@
       <w:r>
         <w:rPr>
           <w:rFonts w:cs="Arial"/>
-          <w:b/>
-          <w:bCs/>
-          <w:spacing w:val="-3"/>
-          <w:sz w:val="20"/>
-          <w:u w:val="single"/>
-          <w:lang w:val="en-US"/>
-        </w:rPr>
-        <w:t xml:space="preserve">Implantation</w:t>
-      </w:r>
-      <w:proofErr w:type="gramEnd"/>
-    </w:p>
-    <w:p>
-      <w:pPr>
-        <w:tabs>
-          <w:tab w:val="left" w:pos="709"/>
-          <w:tab w:val="right" w:pos="9072"/>
-        </w:tabs>
-        <w:suppressAutoHyphens/>
-        <w:overflowPunct w:val="0"/>
-        <w:autoSpaceDE w:val="0"/>
-        <w:autoSpaceDN w:val="0"/>
-        <w:adjustRightInd w:val="0"/>
-        <w:spacing w:before="120"/>
-        <w:ind w:left="720" w:hanging="720"/>
-        <w:jc w:val="both"/>
-        <w:textAlignment w:val="baseline"/>
-        <w:outlineLvl w:val="1"/>
-        <w:rPr>
-          <w:rFonts w:cs="Arial"/>
-          <w:spacing w:val="-3"/>
-          <w:sz w:val="18"/>
-        </w:rPr>
-      </w:pPr>
-      <w:r>
-        <w:rPr>
-          <w:rFonts w:cs="Arial"/>
-          <w:spacing w:val="-3"/>
-          <w:sz w:val="18"/>
-          <w:lang w:val="fr-BE"/>
-        </w:rPr>
-        <w:t xml:space="preserve"/>
-      </w:r>
-      <w:r>
-        <w:rPr>
-          <w:rFonts w:cs="Arial"/>
           <w:spacing w:val="-3"/>
           <w:sz w:val="18"/>
         </w:rPr>
@@ -1875,282 +1562,7 @@
           <w:rFonts w:cs="Arial"/>
           <w:spacing w:val="-3"/>
           <w:sz w:val="18"/>
-        </w:rPr>
-        <w:sym w:font="Wingdings" w:char="F071"/>
-      </w:r>
-      <w:r>
-        <w:rPr>
-          <w:rFonts w:cs="Arial"/>
-          <w:b/>
-          <w:spacing w:val="-3"/>
-          <w:sz w:val="18"/>
-        </w:rPr>
-        <w:t xml:space="preserve">Espace minimum de </w:t>
-      </w:r>
-      <w:smartTag w:uri="urn:schemas-microsoft-com:office:smarttags" w:element="metricconverter">
-        <w:smartTagPr>
-          <w:attr w:name="ProductID" w:val="6 m"/>
-        </w:smartTagPr>
-        <w:r>
-          <w:rPr>
-            <w:rFonts w:cs="Arial"/>
-            <w:b/>
-            <w:spacing w:val="-3"/>
-            <w:sz w:val="18"/>
-          </w:rPr>
-          <w:t>6 m</w:t>
-        </w:r>
-      </w:smartTag>
-      <w:r>
-        <w:rPr>
-          <w:rFonts w:cs="Arial"/>
-          <w:b/>
-          <w:spacing w:val="-3"/>
-          <w:sz w:val="18"/>
-        </w:rPr>
-        <w:t xml:space="preserve"> autour des installations </w:t>
-      </w:r>
-      <w:r>
-        <w:rPr>
-          <w:rFonts w:cs="Arial"/>
-          <w:b/>
-          <w:spacing w:val="-3"/>
-          <w:sz w:val="18"/>
-        </w:rPr>
-        <w:t>à risque</w:t>
-      </w:r>
-      <w:r>
-        <w:rPr>
-          <w:rFonts w:cs="Arial"/>
-          <w:spacing w:val="-3"/>
-          <w:sz w:val="18"/>
-        </w:rPr>
-        <w:t xml:space="preserve"> (</w:t>
-      </w:r>
-      <w:r>
-        <w:rPr>
-          <w:rFonts w:cs="Arial"/>
-          <w:spacing w:val="-3"/>
-          <w:sz w:val="18"/>
-        </w:rPr>
-        <w:t>friterie</w:t>
-      </w:r>
-      <w:r>
-        <w:rPr>
-          <w:rFonts w:cs="Arial"/>
-          <w:spacing w:val="-3"/>
-          <w:sz w:val="18"/>
-        </w:rPr>
-        <w:t>s</w:t>
-      </w:r>
-      <w:r>
-        <w:rPr>
-          <w:rFonts w:cs="Arial"/>
-          <w:spacing w:val="-3"/>
-          <w:sz w:val="18"/>
-        </w:rPr>
-        <w:t>, cuisine</w:t>
-      </w:r>
-      <w:r>
-        <w:rPr>
-          <w:rFonts w:cs="Arial"/>
-          <w:spacing w:val="-3"/>
-          <w:sz w:val="18"/>
-        </w:rPr>
-        <w:t>s, groupe</w:t>
-      </w:r>
-      <w:r>
-        <w:rPr>
-          <w:rFonts w:cs="Arial"/>
-          <w:spacing w:val="-3"/>
-          <w:sz w:val="18"/>
-        </w:rPr>
-        <w:t xml:space="preserve"> </w:t>
-      </w:r>
-      <w:r>
-        <w:rPr>
-          <w:rFonts w:cs="Arial"/>
-          <w:spacing w:val="-3"/>
-          <w:sz w:val="18"/>
-        </w:rPr>
-        <w:t xml:space="preserve">électrogène, chauffage, </w:t>
-      </w:r>
-      <w:proofErr w:type="spellStart"/>
-      <w:r>
-        <w:rPr>
-          <w:rFonts w:cs="Arial"/>
-          <w:spacing w:val="-3"/>
-          <w:sz w:val="18"/>
-        </w:rPr>
-        <w:t>etc</w:t>
-      </w:r>
-      <w:proofErr w:type="spellEnd"/>
-      <w:r>
-        <w:rPr>
-          <w:rFonts w:cs="Arial"/>
-          <w:spacing w:val="-3"/>
-          <w:sz w:val="18"/>
-        </w:rPr>
-        <w:t>)</w:t>
-      </w:r>
-      <w:r>
-        <w:rPr>
-          <w:rFonts w:cs="Arial"/>
-          <w:spacing w:val="-3"/>
-          <w:sz w:val="18"/>
-        </w:rPr>
-        <w:t>.</w:t>
-      </w:r>
-      <w:r>
-        <w:rPr>
-          <w:rFonts w:cs="Arial"/>
-          <w:spacing w:val="-3"/>
-          <w:sz w:val="18"/>
-        </w:rPr>
-        <w:br/>
-      </w:r>
-      <w:r>
-        <w:rPr>
-          <w:rFonts w:cs="Arial"/>
-          <w:spacing w:val="-3"/>
-          <w:sz w:val="18"/>
-        </w:rPr>
-        <w:t xml:space="preserve">Cuisines à min. 2m si chapiteau de plus de 250 m².</w:t>
-      </w:r>
-    </w:p>
-    <w:p>
-      <w:pPr>
-        <w:tabs>
-          <w:tab w:val="left" w:pos="709"/>
-          <w:tab w:val="right" w:pos="9072"/>
-        </w:tabs>
-        <w:suppressAutoHyphens/>
-        <w:overflowPunct w:val="0"/>
-        <w:autoSpaceDE w:val="0"/>
-        <w:autoSpaceDN w:val="0"/>
-        <w:adjustRightInd w:val="0"/>
-        <w:spacing w:before="120"/>
-        <w:ind w:left="720" w:right="3969" w:hanging="720"/>
-        <w:textAlignment w:val="baseline"/>
-        <w:outlineLvl w:val="1"/>
-        <w:rPr>
-          <w:rFonts w:cs="Arial"/>
-          <w:spacing w:val="-3"/>
-          <w:sz w:val="18"/>
           <w:lang w:val="en-US"/>
-        </w:rPr>
-      </w:pPr>
-      <w:r>
-        <w:rPr>
-          <w:rFonts w:cs="Arial"/>
-          <w:spacing w:val="-3"/>
-          <w:sz w:val="18"/>
-          <w:lang w:val="en-US"/>
-        </w:rPr>
-        <w:t xml:space="preserve"/>
-      </w:r>
-      <w:r>
-        <w:rPr>
-          <w:rFonts w:cs="Arial"/>
-          <w:spacing w:val="-3"/>
-          <w:sz w:val="18"/>
-          <w:lang w:val="en-US"/>
-        </w:rPr>
-        <w:t xml:space="preserve"/>
-      </w:r>
-      <w:r>
-        <w:rPr>
-          <w:rFonts w:cs="Arial"/>
-          <w:spacing w:val="-3"/>
-          <w:sz w:val="18"/>
-        </w:rPr>
-        <w:sym w:font="Wingdings" w:char="F071"/>
-      </w:r>
-      <w:r>
-        <w:rPr>
-          <w:rFonts w:cs="Arial"/>
-          <w:spacing w:val="-3"/>
-          <w:sz w:val="18"/>
-        </w:rPr>
-        <w:t xml:space="preserve"> En cas de sécheresse :</w:t>
-      </w:r>
-      <w:r>
-        <w:rPr>
-          <w:rFonts w:cs="Arial"/>
-          <w:b/>
-          <w:spacing w:val="-3"/>
-          <w:sz w:val="18"/>
-        </w:rPr>
-        <w:t xml:space="preserve"> zone débroussaillée d’au moins 6m </w:t>
-      </w:r>
-      <w:r>
-        <w:rPr>
-          <w:rFonts w:cs="Arial"/>
-          <w:spacing w:val="-3"/>
-          <w:sz w:val="18"/>
-        </w:rPr>
-        <w:t>autour des installations si proximité terrain boisé</w:t>
-      </w:r>
-      <w:r>
-        <w:rPr>
-          <w:rFonts w:cs="Arial"/>
-          <w:spacing w:val="-3"/>
-          <w:sz w:val="18"/>
-        </w:rPr>
-        <w:t xml:space="preserve"> </w:t>
-      </w:r>
-      <w:r>
-        <w:rPr>
-          <w:rFonts w:cs="Arial"/>
-          <w:spacing w:val="-3"/>
-          <w:sz w:val="18"/>
-        </w:rPr>
-        <w:t xml:space="preserve">ou recouvert de végétation.</w:t>
-      </w:r>
-    </w:p>
-    <w:p>
-      <w:pPr>
-        <w:tabs>
-          <w:tab w:val="left" w:pos="851"/>
-        </w:tabs>
-        <w:suppressAutoHyphens/>
-        <w:overflowPunct w:val="0"/>
-        <w:autoSpaceDE w:val="0"/>
-        <w:autoSpaceDN w:val="0"/>
-        <w:adjustRightInd w:val="0"/>
-        <w:spacing w:before="240"/>
-        <w:ind w:left="851" w:hanging="851"/>
-        <w:jc w:val="both"/>
-        <w:textAlignment w:val="baseline"/>
-        <w:outlineLvl w:val="3"/>
-        <w:rPr>
-          <w:rFonts w:cs="Arial"/>
-          <w:b/>
-          <w:bCs/>
-          <w:spacing w:val="-3"/>
-          <w:sz w:val="20"/>
-          <w:u w:val="single"/>
-          <w:lang w:val="fr-BE"/>
-        </w:rPr>
-      </w:pPr>
-      <w:r>
-        <w:rPr>
-          <w:rFonts w:cs="Arial"/>
-          <w:spacing w:val="-3"/>
-          <w:sz w:val="18"/>
-          <w:lang w:val="fr-BE"/>
-        </w:rPr>
-        <w:t xml:space="preserve"/>
-      </w:r>
-      <w:r>
-        <w:rPr>
-          <w:rFonts w:cs="Arial"/>
-          <w:b/>
-          <w:bCs/>
-          <w:spacing w:val="-3"/>
-          <w:sz w:val="20"/>
-          <w:u w:val="single"/>
-          <w:lang w:val="fr-BE"/>
         </w:rPr>
         <w:t xml:space="preserve"/>
       </w:r>
@@ -2178,7 +1590,6 @@
         </w:rPr>
         <w:t xml:space="preserve"/>
       </w:r>
-      <w:proofErr w:type="spellStart"/>
       <w:r>
         <w:rPr>
           <w:rFonts w:cs="Arial"/>
@@ -2188,397 +1599,6 @@
           <w:sz w:val="20"/>
           <w:u w:val="single"/>
           <w:lang w:val="en-US"/>
-        </w:rPr>
-        <w:t>Aménagements</w:t>
-      </w:r>
-      <w:proofErr w:type="spellEnd"/>
-      <w:proofErr w:type="gramEnd"/>
-      <w:r>
-        <w:rPr>
-          <w:rFonts w:cs="Arial"/>
-          <w:b/>
-          <w:bCs/>
-          <w:spacing w:val="-3"/>
-          <w:sz w:val="20"/>
-          <w:u w:val="single"/>
-          <w:lang w:val="en-US"/>
-        </w:rPr>
-        <w:t xml:space="preserve"> </w:t>
-      </w:r>
-      <w:proofErr w:type="spellStart"/>
-      <w:r>
-        <w:rPr>
-          <w:rFonts w:cs="Arial"/>
-          <w:b/>
-          <w:bCs/>
-          <w:spacing w:val="-3"/>
-          <w:sz w:val="20"/>
-          <w:u w:val="single"/>
-          <w:lang w:val="en-US"/>
-        </w:rPr>
-        <w:t>structurels</w:t>
-      </w:r>
-      <w:proofErr w:type="spellEnd"/>
-      <w:r>
-        <w:rPr>
-          <w:rFonts w:cs="Arial"/>
-          <w:b/>
-          <w:bCs/>
-          <w:spacing w:val="-3"/>
-          <w:sz w:val="20"/>
-          <w:u w:val="single"/>
-          <w:lang w:val="en-US"/>
-        </w:rPr>
-        <w:t xml:space="preserve"> </w:t>
-      </w:r>
-      <w:proofErr w:type="spellStart"/>
-      <w:r>
-        <w:rPr>
-          <w:rFonts w:cs="Arial"/>
-          <w:b/>
-          <w:bCs/>
-          <w:spacing w:val="-3"/>
-          <w:sz w:val="20"/>
-          <w:u w:val="single"/>
-          <w:lang w:val="en-US"/>
-        </w:rPr>
-        <w:t>intérieurs</w:t>
-      </w:r>
-      <w:proofErr w:type="spellEnd"/>
-      <w:r>
-        <w:rPr>
-          <w:rFonts w:cs="Arial"/>
-          <w:b/>
-          <w:bCs/>
-          <w:spacing w:val="-3"/>
-          <w:sz w:val="20"/>
-          <w:u w:val="single"/>
-          <w:lang w:val="en-US"/>
-        </w:rPr>
-        <w:t xml:space="preserve"> </w:t>
-      </w:r>
-      <w:proofErr w:type="spellStart"/>
-      <w:r>
-        <w:rPr>
-          <w:rFonts w:cs="Arial"/>
-          <w:b/>
-          <w:bCs/>
-          <w:spacing w:val="-3"/>
-          <w:sz w:val="20"/>
-          <w:u w:val="single"/>
-          <w:lang w:val="en-US"/>
-        </w:rPr>
-        <w:t>ou</w:t>
-      </w:r>
-      <w:proofErr w:type="spellEnd"/>
-      <w:r>
-        <w:rPr>
-          <w:rFonts w:cs="Arial"/>
-          <w:b/>
-          <w:bCs/>
-          <w:spacing w:val="-3"/>
-          <w:sz w:val="20"/>
-          <w:u w:val="single"/>
-          <w:lang w:val="en-US"/>
-        </w:rPr>
-        <w:t xml:space="preserve"> </w:t>
-      </w:r>
-      <w:proofErr w:type="spellStart"/>
-      <w:r>
-        <w:rPr>
-          <w:rFonts w:cs="Arial"/>
-          <w:b/>
-          <w:bCs/>
-          <w:spacing w:val="-3"/>
-          <w:sz w:val="20"/>
-          <w:u w:val="single"/>
-          <w:lang w:val="en-US"/>
-        </w:rPr>
-        <w:t xml:space="preserve">extérieurs</w:t>
-      </w:r>
-      <w:proofErr w:type="spellEnd"/>
-    </w:p>
-    <w:p>
-      <w:pPr>
-        <w:tabs>
-          <w:tab w:val="left" w:pos="851"/>
-          <w:tab w:val="right" w:pos="9355"/>
-        </w:tabs>
-        <w:suppressAutoHyphens/>
-        <w:overflowPunct w:val="0"/>
-        <w:autoSpaceDE w:val="0"/>
-        <w:autoSpaceDN w:val="0"/>
-        <w:adjustRightInd w:val="0"/>
-        <w:spacing w:before="120"/>
-        <w:ind w:left="851" w:hanging="851"/>
-        <w:textAlignment w:val="baseline"/>
-        <w:outlineLvl w:val="1"/>
-        <w:rPr>
-          <w:rFonts w:cs="Arial"/>
-          <w:spacing w:val="-3"/>
-          <w:sz w:val="18"/>
-        </w:rPr>
-      </w:pPr>
-      <w:r>
-        <w:rPr>
-          <w:rFonts w:cs="Arial"/>
-          <w:spacing w:val="-3"/>
-          <w:sz w:val="18"/>
-        </w:rPr>
-        <w:t xml:space="preserve"/>
-      </w:r>
-      <w:r>
-        <w:rPr>
-          <w:rFonts w:cs="Arial"/>
-          <w:spacing w:val="-3"/>
-          <w:sz w:val="18"/>
-        </w:rPr>
-        <w:sym w:font="Wingdings" w:char="F071"/>
-      </w:r>
-      <w:r>
-        <w:rPr>
-          <w:rFonts w:cs="Arial"/>
-          <w:spacing w:val="-3"/>
-          <w:sz w:val="18"/>
-        </w:rPr>
-        <w:tab/>
-      </w:r>
-      <w:r>
-        <w:rPr>
-          <w:rFonts w:cs="Arial"/>
-          <w:b/>
-          <w:spacing w:val="-3"/>
-          <w:sz w:val="18"/>
-        </w:rPr>
-        <w:t xml:space="preserve">Escalade des structures interdite</w:t>
-      </w:r>
-      <w:r>
-        <w:rPr>
-          <w:rFonts w:cs="Arial"/>
-          <w:spacing w:val="-3"/>
-          <w:sz w:val="18"/>
-        </w:rPr>
-        <w:t xml:space="preserve"> par barrières, toiles sur une hauteur de 2,5m, service de gardiennage.</w:t>
-      </w:r>
-    </w:p>
-    <w:p>
-      <w:pPr>
-        <w:tabs>
-          <w:tab w:val="left" w:pos="851"/>
-          <w:tab w:val="right" w:pos="9355"/>
-        </w:tabs>
-        <w:suppressAutoHyphens/>
-        <w:overflowPunct w:val="0"/>
-        <w:autoSpaceDE w:val="0"/>
-        <w:autoSpaceDN w:val="0"/>
-        <w:adjustRightInd w:val="0"/>
-        <w:spacing w:before="120"/>
-        <w:ind w:left="851" w:hanging="851"/>
-        <w:jc w:val="both"/>
-        <w:textAlignment w:val="baseline"/>
-        <w:outlineLvl w:val="1"/>
-        <w:rPr>
-          <w:rFonts w:cs="Arial"/>
-          <w:spacing w:val="-3"/>
-          <w:sz w:val="18"/>
-        </w:rPr>
-      </w:pPr>
-      <w:r>
-        <w:rPr>
-          <w:rFonts w:cs="Arial"/>
-          <w:spacing w:val="-3"/>
-          <w:sz w:val="18"/>
-        </w:rPr>
-        <w:t xml:space="preserve"/>
-      </w:r>
-      <w:r>
-        <w:rPr>
-          <w:rFonts w:cs="Arial"/>
-          <w:b/>
-          <w:bCs/>
-          <w:spacing w:val="-3"/>
-          <w:sz w:val="20"/>
-          <w:u w:val="single"/>
-          <w:lang w:val="en-US"/>
-        </w:rPr>
-        <w:t xml:space="preserve"/>
-      </w:r>
-      <w:proofErr w:type="spellStart"/>
-      <w:r>
-        <w:rPr>
-          <w:rFonts w:cs="Arial"/>
-          <w:b/>
-          <w:bCs/>
-          <w:spacing w:val="-3"/>
-          <w:sz w:val="20"/>
-          <w:u w:val="single"/>
-          <w:lang w:val="en-US"/>
-        </w:rPr>
-        <w:t>Précautions</w:t>
-      </w:r>
-      <w:proofErr w:type="spellEnd"/>
-      <w:proofErr w:type="gramEnd"/>
-      <w:r>
-        <w:rPr>
-          <w:rFonts w:cs="Arial"/>
-          <w:b/>
-          <w:bCs/>
-          <w:spacing w:val="-3"/>
-          <w:sz w:val="20"/>
-          <w:u w:val="single"/>
-          <w:lang w:val="en-US"/>
-        </w:rPr>
-        <w:t xml:space="preserve"> </w:t>
-      </w:r>
-      <w:proofErr w:type="spellStart"/>
-      <w:r>
-        <w:rPr>
-          <w:rFonts w:cs="Arial"/>
-          <w:b/>
-          <w:bCs/>
-          <w:spacing w:val="-3"/>
-          <w:sz w:val="20"/>
-          <w:u w:val="single"/>
-          <w:lang w:val="en-US"/>
-        </w:rPr>
-        <w:t>contre</w:t>
-      </w:r>
-      <w:proofErr w:type="spellEnd"/>
-      <w:r>
-        <w:rPr>
-          <w:rFonts w:cs="Arial"/>
-          <w:b/>
-          <w:bCs/>
-          <w:spacing w:val="-3"/>
-          <w:sz w:val="20"/>
-          <w:u w:val="single"/>
-          <w:lang w:val="en-US"/>
-        </w:rPr>
-        <w:t xml:space="preserve"> </w:t>
-      </w:r>
-      <w:proofErr w:type="spellStart"/>
-      <w:r>
-        <w:rPr>
-          <w:rFonts w:cs="Arial"/>
-          <w:b/>
-          <w:bCs/>
-          <w:spacing w:val="-3"/>
-          <w:sz w:val="20"/>
-          <w:u w:val="single"/>
-          <w:lang w:val="en-US"/>
-        </w:rPr>
-        <w:t xml:space="preserve">l’incendie</w:t>
-      </w:r>
-      <w:proofErr w:type="spellEnd"/>
-    </w:p>
-    <w:p>
-      <w:pPr>
-        <w:tabs>
-          <w:tab w:val="left" w:pos="851"/>
-          <w:tab w:val="right" w:pos="9355"/>
-        </w:tabs>
-        <w:suppressAutoHyphens/>
-        <w:overflowPunct w:val="0"/>
-        <w:autoSpaceDE w:val="0"/>
-        <w:autoSpaceDN w:val="0"/>
-        <w:adjustRightInd w:val="0"/>
-        <w:spacing w:before="120"/>
-        <w:ind w:left="851" w:hanging="851"/>
-        <w:jc w:val="both"/>
-        <w:textAlignment w:val="baseline"/>
-        <w:outlineLvl w:val="1"/>
-        <w:rPr>
-          <w:rFonts w:cs="Arial"/>
-          <w:spacing w:val="-3"/>
-          <w:sz w:val="18"/>
-        </w:rPr>
-      </w:pPr>
-      <w:r>
-        <w:rPr>
-          <w:rFonts w:cs="Arial"/>
-          <w:spacing w:val="-3"/>
-          <w:sz w:val="18"/>
-        </w:rPr>
-        <w:t xml:space="preserve"/>
-      </w:r>
-      <w:r>
-        <w:rPr>
-          <w:rFonts w:cs="Arial"/>
-          <w:spacing w:val="-3"/>
-          <w:sz w:val="18"/>
-        </w:rPr>
-        <w:sym w:font="Wingdings" w:char="F071"/>
-      </w:r>
-      <w:r>
-        <w:rPr>
-          <w:rFonts w:cs="Arial"/>
-          <w:spacing w:val="-3"/>
-          <w:sz w:val="18"/>
-        </w:rPr>
-        <w:tab/>
-      </w:r>
-      <w:r>
-        <w:rPr>
-          <w:rFonts w:cs="Arial"/>
-          <w:b/>
-          <w:spacing w:val="-3"/>
-          <w:sz w:val="18"/>
-        </w:rPr>
-        <w:t>Toile</w:t>
-      </w:r>
-      <w:r>
-        <w:rPr>
-          <w:rFonts w:cs="Arial"/>
-          <w:spacing w:val="-3"/>
-          <w:sz w:val="18"/>
-        </w:rPr>
-        <w:t xml:space="preserve"> des tentes et chapiteaux : incombustible ou </w:t>
-      </w:r>
-      <w:r>
-        <w:rPr>
-          <w:rFonts w:cs="Arial"/>
-          <w:b/>
-          <w:spacing w:val="-3"/>
-          <w:sz w:val="18"/>
-        </w:rPr>
-        <w:t xml:space="preserve">difficilement inflammable – Attestation </w:t>
-      </w:r>
-      <w:r>
-        <w:rPr>
-          <w:rFonts w:cs="Arial"/>
-          <w:spacing w:val="-3"/>
-          <w:sz w:val="18"/>
-        </w:rPr>
-        <w:t xml:space="preserve">à fournir.</w:t>
-      </w:r>
-    </w:p>
-    <w:p>
-      <w:pPr>
-        <w:tabs>
-          <w:tab w:val="left" w:pos="851"/>
-          <w:tab w:val="right" w:pos="9355"/>
-        </w:tabs>
-        <w:suppressAutoHyphens/>
-        <w:overflowPunct w:val="0"/>
-        <w:autoSpaceDE w:val="0"/>
-        <w:autoSpaceDN w:val="0"/>
-        <w:adjustRightInd w:val="0"/>
-        <w:spacing w:before="120"/>
-        <w:ind w:left="851" w:hanging="851"/>
-        <w:jc w:val="both"/>
-        <w:textAlignment w:val="baseline"/>
-        <w:outlineLvl w:val="1"/>
-        <w:rPr>
-          <w:rFonts w:cs="Arial"/>
-          <w:spacing w:val="-3"/>
-          <w:sz w:val="18"/>
-        </w:rPr>
-      </w:pPr>
-      <w:r>
-        <w:rPr>
-          <w:rFonts w:cs="Arial"/>
-          <w:spacing w:val="-3"/>
-          <w:sz w:val="18"/>
         </w:rPr>
         <w:t xml:space="preserve"/>
       </w:r>
@@ -2603,272 +1623,6 @@
           <w:sz w:val="20"/>
           <w:u w:val="single"/>
           <w:lang w:val="en-US"/>
-        </w:rPr>
-        <w:t>Evacuation</w:t>
-      </w:r>
-      <w:proofErr w:type="gramEnd"/>
-      <w:r>
-        <w:rPr>
-          <w:rFonts w:cs="Arial"/>
-          <w:b/>
-          <w:bCs/>
-          <w:spacing w:val="-3"/>
-          <w:sz w:val="20"/>
-          <w:u w:val="single"/>
-          <w:lang w:val="en-US"/>
-        </w:rPr>
-        <w:t xml:space="preserve"> – </w:t>
-      </w:r>
-      <w:proofErr w:type="spellStart"/>
-      <w:r>
-        <w:rPr>
-          <w:rFonts w:cs="Arial"/>
-          <w:b/>
-          <w:bCs/>
-          <w:spacing w:val="-3"/>
-          <w:sz w:val="20"/>
-          <w:u w:val="single"/>
-          <w:lang w:val="en-US"/>
-        </w:rPr>
-        <w:t>dégagements</w:t>
-      </w:r>
-      <w:proofErr w:type="spellEnd"/>
-      <w:r>
-        <w:rPr>
-          <w:rFonts w:cs="Arial"/>
-          <w:b/>
-          <w:bCs/>
-          <w:spacing w:val="-3"/>
-          <w:sz w:val="20"/>
-          <w:u w:val="single"/>
-          <w:lang w:val="en-US"/>
-        </w:rPr>
-        <w:t xml:space="preserve">, sorties et sorties de secours</w:t>
-      </w:r>
-    </w:p>
-    <w:p>
-      <w:pPr>
-        <w:tabs>
-          <w:tab w:val="left" w:pos="851"/>
-          <w:tab w:val="right" w:pos="9355"/>
-        </w:tabs>
-        <w:suppressAutoHyphens/>
-        <w:overflowPunct w:val="0"/>
-        <w:autoSpaceDE w:val="0"/>
-        <w:autoSpaceDN w:val="0"/>
-        <w:adjustRightInd w:val="0"/>
-        <w:spacing w:before="120"/>
-        <w:ind w:left="851" w:hanging="851"/>
-        <w:jc w:val="both"/>
-        <w:textAlignment w:val="baseline"/>
-        <w:outlineLvl w:val="1"/>
-        <w:rPr>
-          <w:rFonts w:cs="Arial"/>
-          <w:spacing w:val="-3"/>
-          <w:sz w:val="18"/>
-        </w:rPr>
-      </w:pPr>
-      <w:r>
-        <w:rPr>
-          <w:rFonts w:cs="Arial"/>
-          <w:spacing w:val="-3"/>
-          <w:sz w:val="18"/>
-        </w:rPr>
-        <w:t xml:space="preserve"/>
-      </w:r>
-      <w:r>
-        <w:rPr>
-          <w:rFonts w:cs="Arial"/>
-          <w:spacing w:val="-3"/>
-          <w:sz w:val="18"/>
-        </w:rPr>
-        <w:sym w:font="Wingdings" w:char="F071"/>
-      </w:r>
-      <w:r>
-        <w:rPr>
-          <w:rFonts w:cs="Arial"/>
-          <w:b/>
-          <w:spacing w:val="-3"/>
-          <w:sz w:val="18"/>
-        </w:rPr>
-        <w:t>Maximum 30 mètres</w:t>
-      </w:r>
-      <w:r>
-        <w:rPr>
-          <w:rFonts w:cs="Arial"/>
-          <w:spacing w:val="-3"/>
-          <w:sz w:val="18"/>
-        </w:rPr>
-        <w:t xml:space="preserve"> à parcourir </w:t>
-      </w:r>
-      <w:r>
-        <w:rPr>
-          <w:rFonts w:cs="Arial"/>
-          <w:b/>
-          <w:spacing w:val="-3"/>
-          <w:sz w:val="18"/>
-        </w:rPr>
-        <w:t xml:space="preserve">pour atteindre une </w:t>
-      </w:r>
-      <w:proofErr w:type="gramStart"/>
-      <w:r>
-        <w:rPr>
-          <w:rFonts w:cs="Arial"/>
-          <w:b/>
-          <w:spacing w:val="-3"/>
-          <w:sz w:val="18"/>
-        </w:rPr>
-        <w:t>issue</w:t>
-      </w:r>
-      <w:r>
-        <w:rPr>
-          <w:rFonts w:cs="Arial"/>
-          <w:spacing w:val="-3"/>
-          <w:sz w:val="18"/>
-        </w:rPr>
-        <w:t xml:space="preserve">:</w:t>
-      </w:r>
-      <w:proofErr w:type="gramEnd"/>
-    </w:p>
-    <w:p>
-      <w:pPr>
-        <w:tabs>
-          <w:tab w:val="left" w:pos="851"/>
-          <w:tab w:val="right" w:pos="9355"/>
-        </w:tabs>
-        <w:suppressAutoHyphens/>
-        <w:overflowPunct w:val="0"/>
-        <w:autoSpaceDE w:val="0"/>
-        <w:autoSpaceDN w:val="0"/>
-        <w:adjustRightInd w:val="0"/>
-        <w:spacing w:before="120"/>
-        <w:ind w:left="851" w:hanging="851"/>
-        <w:jc w:val="both"/>
-        <w:textAlignment w:val="baseline"/>
-        <w:outlineLvl w:val="1"/>
-        <w:rPr>
-          <w:rFonts w:cs="Arial"/>
-          <w:spacing w:val="-3"/>
-          <w:sz w:val="18"/>
-        </w:rPr>
-      </w:pPr>
-      <w:r>
-        <w:rPr>
-          <w:rFonts w:cs="Arial"/>
-          <w:spacing w:val="-3"/>
-          <w:sz w:val="18"/>
-        </w:rPr>
-        <w:t xml:space="preserve"/>
-      </w:r>
-      <w:r>
-        <w:rPr>
-          <w:rFonts w:cs="Arial"/>
-          <w:spacing w:val="-3"/>
-          <w:sz w:val="18"/>
-        </w:rPr>
-        <w:sym w:font="Wingdings" w:char="F071"/>
-      </w:r>
-      <w:r>
-        <w:rPr>
-          <w:rFonts w:cs="Arial"/>
-          <w:spacing w:val="-3"/>
-          <w:sz w:val="18"/>
-        </w:rPr>
-        <w:tab/>
-        <w:t>S</w:t>
-      </w:r>
-      <w:r>
-        <w:rPr>
-          <w:rFonts w:cs="Arial"/>
-          <w:spacing w:val="-3"/>
-          <w:sz w:val="18"/>
-        </w:rPr>
-        <w:t xml:space="preserve">orties </w:t>
-      </w:r>
-      <w:r>
-        <w:rPr>
-          <w:rFonts w:cs="Arial"/>
-          <w:spacing w:val="-3"/>
-          <w:sz w:val="18"/>
-        </w:rPr>
-        <w:t>aboutissent</w:t>
-      </w:r>
-      <w:r>
-        <w:rPr>
-          <w:rFonts w:cs="Arial"/>
-          <w:spacing w:val="-3"/>
-          <w:sz w:val="18"/>
-        </w:rPr>
-        <w:t xml:space="preserve"> directement à la voie publique ou à un espace situé à l'air libre et permettant d'atteindre</w:t>
-      </w:r>
-      <w:r>
-        <w:rPr>
-          <w:rFonts w:cs="Arial"/>
-          <w:spacing w:val="-3"/>
-          <w:sz w:val="18"/>
-        </w:rPr>
-        <w:t xml:space="preserve"> </w:t>
-      </w:r>
-      <w:r>
-        <w:rPr>
-          <w:rFonts w:cs="Arial"/>
-          <w:spacing w:val="-3"/>
-          <w:sz w:val="18"/>
-        </w:rPr>
-        <w:t xml:space="preserve">aisément la voie publique. Les sorties ne </w:t>
-      </w:r>
-      <w:r>
-        <w:rPr>
-          <w:rFonts w:cs="Arial"/>
-          <w:spacing w:val="-3"/>
-          <w:sz w:val="18"/>
-        </w:rPr>
-        <w:t>passent pas</w:t>
-      </w:r>
-      <w:r>
-        <w:rPr>
-          <w:rFonts w:cs="Arial"/>
-          <w:spacing w:val="-3"/>
-          <w:sz w:val="18"/>
-        </w:rPr>
-        <w:t xml:space="preserve"> par d'autres installations voisines</w:t>
-      </w:r>
-      <w:r>
-        <w:rPr>
-          <w:rFonts w:cs="Arial"/>
-          <w:spacing w:val="-3"/>
-          <w:sz w:val="18"/>
-        </w:rPr>
-        <w:t xml:space="preserve">.</w:t>
-      </w:r>
-    </w:p>
-    <w:p>
-      <w:pPr>
-        <w:tabs>
-          <w:tab w:val="left" w:pos="851"/>
-          <w:tab w:val="right" w:pos="9355"/>
-        </w:tabs>
-        <w:suppressAutoHyphens/>
-        <w:overflowPunct w:val="0"/>
-        <w:autoSpaceDE w:val="0"/>
-        <w:autoSpaceDN w:val="0"/>
-        <w:adjustRightInd w:val="0"/>
-        <w:spacing w:before="120"/>
-        <w:ind w:left="851" w:hanging="851"/>
-        <w:jc w:val="both"/>
-        <w:textAlignment w:val="baseline"/>
-        <w:outlineLvl w:val="1"/>
-        <w:rPr>
-          <w:rFonts w:cs="Arial"/>
-          <w:spacing w:val="-3"/>
-          <w:sz w:val="18"/>
-        </w:rPr>
-      </w:pPr>
-      <w:r>
-        <w:rPr>
-          <w:rFonts w:cs="Arial"/>
-          <w:spacing w:val="-3"/>
-          <w:sz w:val="18"/>
         </w:rPr>
         <w:t xml:space="preserve"/>
       </w:r>
@@ -2916,148 +1670,11 @@
         </w:rPr>
         <w:t xml:space="preserve"/>
       </w:r>
-      <w:proofErr w:type="spellStart"/>
-      <w:r>
-        <w:rPr>
-          <w:rFonts w:cs="Arial"/>
-          <w:b/>
-          <w:bCs/>
-          <w:spacing w:val="-3"/>
-          <w:sz w:val="20"/>
-          <w:u w:val="single"/>
-          <w:lang w:val="en-US"/>
-        </w:rPr>
-        <w:t>Eclairage</w:t>
-      </w:r>
-      <w:proofErr w:type="spellEnd"/>
-      <w:proofErr w:type="gramEnd"/>
-      <w:r>
-        <w:rPr>
-          <w:rFonts w:cs="Arial"/>
-          <w:b/>
-          <w:bCs/>
-          <w:spacing w:val="-3"/>
-          <w:sz w:val="20"/>
-          <w:u w:val="single"/>
-          <w:lang w:val="en-US"/>
-        </w:rPr>
-        <w:t xml:space="preserve"> de sécurité</w:t>
-      </w:r>
-    </w:p>
-    <w:p>
-      <w:pPr>
-        <w:tabs>
-          <w:tab w:val="left" w:pos="851"/>
-          <w:tab w:val="right" w:pos="9355"/>
-        </w:tabs>
-        <w:suppressAutoHyphens/>
-        <w:overflowPunct w:val="0"/>
-        <w:autoSpaceDE w:val="0"/>
-        <w:autoSpaceDN w:val="0"/>
-        <w:adjustRightInd w:val="0"/>
-        <w:spacing w:before="120"/>
-        <w:ind w:left="851" w:hanging="851"/>
-        <w:jc w:val="both"/>
-        <w:textAlignment w:val="baseline"/>
-        <w:outlineLvl w:val="1"/>
-        <w:rPr>
-          <w:rFonts w:cs="Arial"/>
-          <w:b/>
-          <w:spacing w:val="-3"/>
-          <w:sz w:val="18"/>
-        </w:rPr>
-      </w:pPr>
       <w:r>
         <w:rPr>
           <w:rFonts w:cs="Arial"/>
           <w:spacing w:val="-3"/>
           <w:sz w:val="18"/>
-          <w:lang w:val="fr-BE"/>
-        </w:rPr>
-        <w:t xml:space="preserve"/>
-      </w:r>
-      <w:r>
-        <w:rPr>
-          <w:rFonts w:cs="Arial"/>
-          <w:spacing w:val="-3"/>
-          <w:sz w:val="18"/>
-        </w:rPr>
-        <w:t xml:space="preserve"/>
-      </w:r>
-      <w:r>
-        <w:rPr>
-          <w:rFonts w:cs="Arial"/>
-          <w:spacing w:val="-3"/>
-          <w:sz w:val="18"/>
-        </w:rPr>
-        <w:sym w:font="Wingdings" w:char="F071"/>
-      </w:r>
-      <w:proofErr w:type="spellStart"/>
-      <w:r>
-        <w:rPr>
-          <w:rFonts w:cs="Arial"/>
-          <w:b/>
-          <w:spacing w:val="-3"/>
-          <w:sz w:val="18"/>
-        </w:rPr>
-        <w:t>E</w:t>
-      </w:r>
-      <w:r>
-        <w:rPr>
-          <w:rFonts w:cs="Arial"/>
-          <w:b/>
-          <w:spacing w:val="-3"/>
-          <w:sz w:val="18"/>
-        </w:rPr>
-        <w:t xml:space="preserve">clairage</w:t>
-      </w:r>
-      <w:proofErr w:type="spellEnd"/>
-      <w:r>
-        <w:rPr>
-          <w:rFonts w:cs="Arial"/>
-          <w:b/>
-          <w:spacing w:val="-3"/>
-          <w:sz w:val="18"/>
-        </w:rPr>
-        <w:t xml:space="preserve"> de sécurité</w:t>
-      </w:r>
-      <w:r>
-        <w:rPr>
-          <w:rFonts w:cs="Arial"/>
-          <w:spacing w:val="-3"/>
-          <w:sz w:val="18"/>
-        </w:rPr>
-        <w:t xml:space="preserve"> testé avant chaque occupation des lieux.</w:t>
-      </w:r>
-    </w:p>
-    <w:p>
-      <w:pPr>
-        <w:suppressAutoHyphens/>
-        <w:overflowPunct w:val="0"/>
-        <w:autoSpaceDE w:val="0"/>
-        <w:autoSpaceDN w:val="0"/>
-        <w:adjustRightInd w:val="0"/>
-        <w:spacing w:before="240"/>
-        <w:ind w:left="851" w:hanging="851"/>
-        <w:jc w:val="both"/>
-        <w:textAlignment w:val="baseline"/>
-        <w:outlineLvl w:val="0"/>
-        <w:rPr>
-          <w:rFonts w:cs="Arial"/>
-          <w:b/>
-          <w:bCs/>
-          <w:spacing w:val="-3"/>
-          <w:sz w:val="20"/>
-          <w:u w:val="single"/>
-          <w:lang w:val="en-US"/>
-        </w:rPr>
-      </w:pPr>
-      <w:r>
-        <w:rPr>
-          <w:rFonts w:cs="Arial"/>
-          <w:spacing w:val="-3"/>
-          <w:sz w:val="18"/>
-          <w:lang w:val="en-US"/>
         </w:rPr>
         <w:t xml:space="preserve"/>
       </w:r>
@@ -3117,196 +1734,6 @@
         </w:rPr>
         <w:t xml:space="preserve"/>
       </w:r>
-      <w:proofErr w:type="spellStart"/>
-      <w:r>
-        <w:rPr>
-          <w:rFonts w:cs="Arial"/>
-          <w:b/>
-          <w:bCs/>
-          <w:spacing w:val="-3"/>
-          <w:sz w:val="20"/>
-          <w:u w:val="single"/>
-          <w:lang w:val="en-US"/>
-        </w:rPr>
-        <w:t>Annonce</w:t>
-      </w:r>
-      <w:proofErr w:type="spellEnd"/>
-      <w:proofErr w:type="gramEnd"/>
-      <w:r>
-        <w:rPr>
-          <w:rFonts w:cs="Arial"/>
-          <w:b/>
-          <w:bCs/>
-          <w:spacing w:val="-3"/>
-          <w:sz w:val="20"/>
-          <w:u w:val="single"/>
-          <w:lang w:val="en-US"/>
-        </w:rPr>
-        <w:t xml:space="preserve"> - Alerte – </w:t>
-      </w:r>
-      <w:proofErr w:type="spellStart"/>
-      <w:r>
-        <w:rPr>
-          <w:rFonts w:cs="Arial"/>
-          <w:b/>
-          <w:bCs/>
-          <w:spacing w:val="-3"/>
-          <w:sz w:val="20"/>
-          <w:u w:val="single"/>
-          <w:lang w:val="en-US"/>
-        </w:rPr>
-        <w:t xml:space="preserve">Alarme</w:t>
-      </w:r>
-      <w:proofErr w:type="spellEnd"/>
-    </w:p>
-    <w:p>
-      <w:pPr>
-        <w:tabs>
-          <w:tab w:val="left" w:pos="851"/>
-          <w:tab w:val="right" w:pos="9355"/>
-        </w:tabs>
-        <w:suppressAutoHyphens/>
-        <w:overflowPunct w:val="0"/>
-        <w:autoSpaceDE w:val="0"/>
-        <w:autoSpaceDN w:val="0"/>
-        <w:adjustRightInd w:val="0"/>
-        <w:spacing w:before="120"/>
-        <w:ind w:left="851" w:hanging="851"/>
-        <w:jc w:val="both"/>
-        <w:textAlignment w:val="baseline"/>
-        <w:outlineLvl w:val="1"/>
-        <w:rPr>
-          <w:rFonts w:cs="Arial"/>
-          <w:spacing w:val="-3"/>
-          <w:sz w:val="18"/>
-        </w:rPr>
-      </w:pPr>
-      <w:r>
-        <w:rPr>
-          <w:rFonts w:cs="Arial"/>
-          <w:spacing w:val="-3"/>
-          <w:sz w:val="18"/>
-        </w:rPr>
-        <w:t xml:space="preserve"/>
-      </w:r>
-      <w:r>
-        <w:rPr>
-          <w:rFonts w:cs="Arial"/>
-          <w:spacing w:val="-3"/>
-          <w:sz w:val="18"/>
-        </w:rPr>
-        <w:sym w:font="Wingdings" w:char="F071"/>
-      </w:r>
-      <w:proofErr w:type="spellStart"/>
-      <w:r>
-        <w:rPr>
-          <w:rFonts w:cs="Arial"/>
-          <w:spacing w:val="-3"/>
-          <w:sz w:val="18"/>
-          <w:lang w:val="en-US"/>
-        </w:rPr>
-        <w:t>Numéro</w:t>
-      </w:r>
-      <w:proofErr w:type="spellEnd"/>
-      <w:r>
-        <w:rPr>
-          <w:rFonts w:cs="Arial"/>
-          <w:spacing w:val="-3"/>
-          <w:sz w:val="18"/>
-          <w:lang w:val="en-US"/>
-        </w:rPr>
-        <w:t xml:space="preserve"> </w:t>
-      </w:r>
-      <w:proofErr w:type="spellStart"/>
-      <w:r>
-        <w:rPr>
-          <w:rFonts w:cs="Arial"/>
-          <w:spacing w:val="-3"/>
-          <w:sz w:val="18"/>
-          <w:lang w:val="en-US"/>
-        </w:rPr>
-        <w:t>d’urgence</w:t>
-      </w:r>
-      <w:proofErr w:type="spellEnd"/>
-      <w:r>
-        <w:rPr>
-          <w:rFonts w:cs="Arial"/>
-          <w:spacing w:val="-3"/>
-          <w:sz w:val="18"/>
-          <w:lang w:val="en-US"/>
-        </w:rPr>
-        <w:t xml:space="preserve"> </w:t>
-      </w:r>
-      <w:r>
-        <w:rPr>
-          <w:rFonts w:cs="Arial"/>
-          <w:b/>
-          <w:spacing w:val="-3"/>
-          <w:sz w:val="18"/>
-          <w:lang w:val="en-US"/>
-        </w:rPr>
-        <w:t>112</w:t>
-      </w:r>
-      <w:r>
-        <w:rPr>
-          <w:rFonts w:cs="Arial"/>
-          <w:spacing w:val="-3"/>
-          <w:sz w:val="18"/>
-          <w:lang w:val="en-US"/>
-        </w:rPr>
-        <w:t xml:space="preserve"> </w:t>
-      </w:r>
-      <w:proofErr w:type="spellStart"/>
-      <w:r>
-        <w:rPr>
-          <w:rFonts w:cs="Arial"/>
-          <w:spacing w:val="-3"/>
-          <w:sz w:val="18"/>
-          <w:lang w:val="en-US"/>
-        </w:rPr>
-        <w:t>affiché</w:t>
-      </w:r>
-      <w:proofErr w:type="spellEnd"/>
-      <w:r>
-        <w:rPr>
-          <w:rFonts w:cs="Arial"/>
-          <w:spacing w:val="-3"/>
-          <w:sz w:val="18"/>
-          <w:lang w:val="en-US"/>
-        </w:rPr>
-        <w:t xml:space="preserve">.</w:t>
-      </w:r>
-    </w:p>
-    <w:p>
-      <w:pPr>
-        <w:tabs>
-          <w:tab w:val="left" w:pos="851"/>
-          <w:tab w:val="right" w:pos="9355"/>
-        </w:tabs>
-        <w:suppressAutoHyphens/>
-        <w:overflowPunct w:val="0"/>
-        <w:autoSpaceDE w:val="0"/>
-        <w:autoSpaceDN w:val="0"/>
-        <w:adjustRightInd w:val="0"/>
-        <w:spacing w:before="120"/>
-        <w:ind w:left="851" w:hanging="851"/>
-        <w:jc w:val="both"/>
-        <w:textAlignment w:val="baseline"/>
-        <w:outlineLvl w:val="1"/>
-        <w:rPr>
-          <w:rFonts w:cs="Arial"/>
-          <w:spacing w:val="-3"/>
-          <w:sz w:val="18"/>
-        </w:rPr>
-      </w:pPr>
-      <w:r>
-        <w:rPr>
-          <w:rFonts w:cs="Arial"/>
-          <w:spacing w:val="-3"/>
-          <w:sz w:val="18"/>
-        </w:rPr>
-        <w:t xml:space="preserve"/>
-      </w:r>
       <w:r>
         <w:rPr>
           <w:rFonts w:cs="Arial"/>
@@ -3327,139 +1754,6 @@
           <w:spacing w:val="-3"/>
           <w:sz w:val="20"/>
           <w:u w:val="single"/>
-          <w:lang w:val="en-US"/>
-        </w:rPr>
-        <w:t xml:space="preserve"/>
-      </w:r>
-      <w:proofErr w:type="spellStart"/>
-      <w:r>
-        <w:rPr>
-          <w:rFonts w:cs="Arial"/>
-          <w:b/>
-          <w:bCs/>
-          <w:spacing w:val="-3"/>
-          <w:sz w:val="20"/>
-          <w:u w:val="single"/>
-          <w:lang w:val="en-US"/>
-        </w:rPr>
-        <w:t>Tentes</w:t>
-      </w:r>
-      <w:proofErr w:type="spellEnd"/>
-      <w:proofErr w:type="gramEnd"/>
-      <w:r>
-        <w:rPr>
-          <w:rFonts w:cs="Arial"/>
-          <w:b/>
-          <w:bCs/>
-          <w:spacing w:val="-3"/>
-          <w:sz w:val="20"/>
-          <w:u w:val="single"/>
-          <w:lang w:val="en-US"/>
-        </w:rPr>
-        <w:t xml:space="preserve"> (de </w:t>
-      </w:r>
-      <w:proofErr w:type="spellStart"/>
-      <w:r>
-        <w:rPr>
-          <w:rFonts w:cs="Arial"/>
-          <w:b/>
-          <w:bCs/>
-          <w:spacing w:val="-3"/>
-          <w:sz w:val="20"/>
-          <w:u w:val="single"/>
-          <w:lang w:val="en-US"/>
-        </w:rPr>
-        <w:t xml:space="preserve">moins</w:t>
-      </w:r>
-      <w:proofErr w:type="spellEnd"/>
-      <w:r>
-        <w:rPr>
-          <w:rFonts w:cs="Arial"/>
-          <w:b/>
-          <w:bCs/>
-          <w:spacing w:val="-3"/>
-          <w:sz w:val="20"/>
-          <w:u w:val="single"/>
-          <w:lang w:val="en-US"/>
-        </w:rPr>
-        <w:t xml:space="preserve"> de 60 m²)</w:t>
-      </w:r>
-    </w:p>
-    <w:p>
-      <w:pPr>
-        <w:tabs>
-          <w:tab w:val="left" w:pos="851"/>
-          <w:tab w:val="right" w:pos="9355"/>
-        </w:tabs>
-        <w:suppressAutoHyphens/>
-        <w:overflowPunct w:val="0"/>
-        <w:autoSpaceDE w:val="0"/>
-        <w:autoSpaceDN w:val="0"/>
-        <w:adjustRightInd w:val="0"/>
-        <w:spacing w:before="120"/>
-        <w:ind w:left="851" w:hanging="851"/>
-        <w:jc w:val="both"/>
-        <w:textAlignment w:val="baseline"/>
-        <w:outlineLvl w:val="1"/>
-        <w:rPr>
-          <w:rFonts w:cs="Arial"/>
-          <w:spacing w:val="-3"/>
-          <w:sz w:val="18"/>
-        </w:rPr>
-      </w:pPr>
-      <w:r>
-        <w:rPr>
-          <w:rFonts w:cs="Arial"/>
-          <w:spacing w:val="-3"/>
-          <w:sz w:val="18"/>
-        </w:rPr>
-        <w:t xml:space="preserve"/>
-      </w:r>
-      <w:r>
-        <w:rPr>
-          <w:rFonts w:cs="Arial"/>
-          <w:spacing w:val="-3"/>
-          <w:sz w:val="18"/>
-        </w:rPr>
-        <w:sym w:font="Wingdings" w:char="F071"/>
-      </w:r>
-      <w:r>
-        <w:rPr>
-          <w:rFonts w:cs="Arial"/>
-          <w:spacing w:val="-3"/>
-          <w:sz w:val="18"/>
-        </w:rPr>
-        <w:tab/>
-        <w:t xml:space="preserve">Dans le cas d’installations bâchées, au droit des sorties, les toiles peuvent être maintenues pendantes mais ne peuvent en aucun cas être maintenues attachées sur les côtés latéraux et inférieurs et doivent pouvoir être ouvertes facilement et immédiatement par toute personne.</w:t>
-      </w:r>
-    </w:p>
-    <w:p>
-      <w:pPr>
-        <w:suppressAutoHyphens/>
-        <w:overflowPunct w:val="0"/>
-        <w:autoSpaceDE w:val="0"/>
-        <w:autoSpaceDN w:val="0"/>
-        <w:adjustRightInd w:val="0"/>
-        <w:spacing w:before="240"/>
-        <w:ind w:left="851" w:hanging="851"/>
-        <w:jc w:val="both"/>
-        <w:textAlignment w:val="baseline"/>
-        <w:outlineLvl w:val="0"/>
-        <w:rPr>
-          <w:rFonts w:cs="Arial"/>
-          <w:b/>
-          <w:bCs/>
-          <w:spacing w:val="-3"/>
-          <w:sz w:val="20"/>
-          <w:u w:val="single"/>
-          <w:lang w:val="en-US"/>
-        </w:rPr>
-      </w:pPr>
-      <w:r>
-        <w:rPr>
-          <w:rFonts w:cs="Arial"/>
-          <w:spacing w:val="-3"/>
-          <w:sz w:val="18"/>
           <w:lang w:val="en-US"/>
         </w:rPr>
         <w:t xml:space="preserve"/>
@@ -3488,187 +1782,6 @@
         </w:rPr>
         <w:t xml:space="preserve"/>
       </w:r>
-      <w:proofErr w:type="spellStart"/>
-      <w:r>
-        <w:rPr>
-          <w:rFonts w:cs="Arial"/>
-          <w:b/>
-          <w:bCs/>
-          <w:spacing w:val="-3"/>
-          <w:sz w:val="20"/>
-          <w:u w:val="single"/>
-          <w:lang w:val="en-US"/>
-        </w:rPr>
-        <w:t>Evénements</w:t>
-      </w:r>
-      <w:proofErr w:type="spellEnd"/>
-      <w:proofErr w:type="gramEnd"/>
-      <w:r>
-        <w:rPr>
-          <w:rFonts w:cs="Arial"/>
-          <w:b/>
-          <w:bCs/>
-          <w:spacing w:val="-3"/>
-          <w:sz w:val="20"/>
-          <w:u w:val="single"/>
-          <w:lang w:val="en-US"/>
-        </w:rPr>
-        <w:t xml:space="preserve"> (foule, concerts, soirées) </w:t>
-      </w:r>
-      <w:proofErr w:type="spellStart"/>
-      <w:r>
-        <w:rPr>
-          <w:rFonts w:cs="Arial"/>
-          <w:b/>
-          <w:bCs/>
-          <w:spacing w:val="-3"/>
-          <w:sz w:val="20"/>
-          <w:u w:val="single"/>
-          <w:lang w:val="en-US"/>
-        </w:rPr>
-        <w:t xml:space="preserve">en</w:t>
-      </w:r>
-      <w:proofErr w:type="spellEnd"/>
-      <w:r>
-        <w:rPr>
-          <w:rFonts w:cs="Arial"/>
-          <w:b/>
-          <w:bCs/>
-          <w:spacing w:val="-3"/>
-          <w:sz w:val="20"/>
-          <w:u w:val="single"/>
-          <w:lang w:val="en-US"/>
-        </w:rPr>
-        <w:t xml:space="preserve"> plein air</w:t>
-      </w:r>
-    </w:p>
-    <w:p>
-      <w:pPr>
-        <w:tabs>
-          <w:tab w:val="left" w:pos="851"/>
-          <w:tab w:val="right" w:pos="9355"/>
-        </w:tabs>
-        <w:suppressAutoHyphens/>
-        <w:overflowPunct w:val="0"/>
-        <w:autoSpaceDE w:val="0"/>
-        <w:autoSpaceDN w:val="0"/>
-        <w:adjustRightInd w:val="0"/>
-        <w:spacing w:before="120"/>
-        <w:ind w:left="851" w:hanging="851"/>
-        <w:jc w:val="both"/>
-        <w:textAlignment w:val="baseline"/>
-        <w:outlineLvl w:val="1"/>
-        <w:rPr>
-          <w:rFonts w:cs="Arial"/>
-          <w:spacing w:val="-3"/>
-          <w:sz w:val="18"/>
-        </w:rPr>
-      </w:pPr>
-      <w:r>
-        <w:rPr>
-          <w:rFonts w:cs="Arial"/>
-          <w:spacing w:val="-3"/>
-          <w:sz w:val="18"/>
-        </w:rPr>
-        <w:t xml:space="preserve"/>
-      </w:r>
-      <w:r>
-        <w:rPr>
-          <w:rFonts w:cs="Arial"/>
-          <w:spacing w:val="-3"/>
-          <w:sz w:val="18"/>
-        </w:rPr>
-        <w:sym w:font="Wingdings" w:char="F071"/>
-      </w:r>
-      <w:r>
-        <w:rPr>
-          <w:rFonts w:cs="Arial"/>
-          <w:spacing w:val="-3"/>
-          <w:sz w:val="18"/>
-        </w:rPr>
-        <w:tab/>
-      </w:r>
-      <w:r>
-        <w:rPr>
-          <w:rFonts w:cs="Arial"/>
-          <w:b/>
-          <w:spacing w:val="-3"/>
-          <w:sz w:val="18"/>
-        </w:rPr>
-        <w:t xml:space="preserve">Issues dans </w:t>
-      </w:r>
-      <w:r>
-        <w:rPr>
-          <w:rFonts w:cs="Arial"/>
-          <w:b/>
-          <w:spacing w:val="-3"/>
-          <w:sz w:val="18"/>
-        </w:rPr>
-        <w:t>des parois de barrières Heras</w:t>
-      </w:r>
-      <w:r>
-        <w:rPr>
-          <w:rFonts w:cs="Arial"/>
-          <w:spacing w:val="-3"/>
-          <w:sz w:val="18"/>
-        </w:rPr>
-        <w:t xml:space="preserve"> : </w:t>
-      </w:r>
-      <w:r>
-        <w:rPr>
-          <w:rFonts w:cs="Arial"/>
-          <w:spacing w:val="-3"/>
-          <w:sz w:val="18"/>
-        </w:rPr>
-        <w:t xml:space="preserve">autorisées pour autant que </w:t>
-      </w:r>
-      <w:r>
-        <w:rPr>
-          <w:rFonts w:cs="Arial"/>
-          <w:spacing w:val="-3"/>
-          <w:sz w:val="18"/>
-        </w:rPr>
-        <w:t>celles-ci soient munies d’une roulette de manœuvre sur un de leurs pieds, que l’aire de manœuvre reste libre en permanence, qu’elles soient munies d’un large pictogramme et qu’un agent de gardiennage ou un steward soit présent en permanence pour les manœuvrer</w:t>
-      </w:r>
-      <w:r>
-        <w:rPr>
-          <w:rFonts w:cs="Arial"/>
-          <w:spacing w:val="-3"/>
-          <w:sz w:val="18"/>
-        </w:rPr>
-        <w:t xml:space="preserve">.</w:t>
-      </w:r>
-    </w:p>
-    <w:p>
-      <w:pPr>
-        <w:tabs>
-          <w:tab w:val="left" w:pos="851"/>
-          <w:tab w:val="right" w:pos="8931"/>
-        </w:tabs>
-        <w:suppressAutoHyphens/>
-        <w:overflowPunct w:val="0"/>
-        <w:autoSpaceDE w:val="0"/>
-        <w:autoSpaceDN w:val="0"/>
-        <w:adjustRightInd w:val="0"/>
-        <w:spacing w:before="120"/>
-        <w:ind w:left="851" w:hanging="851"/>
-        <w:jc w:val="both"/>
-        <w:textAlignment w:val="baseline"/>
-        <w:outlineLvl w:val="1"/>
-        <w:rPr>
-          <w:rFonts w:cs="Arial"/>
-          <w:spacing w:val="-3"/>
-          <w:sz w:val="18"/>
-        </w:rPr>
-      </w:pPr>
-      <w:r>
-        <w:rPr>
-          <w:rFonts w:cs="Arial"/>
-          <w:spacing w:val="-3"/>
-          <w:sz w:val="18"/>
-        </w:rPr>
-        <w:t xml:space="preserve"/>
-      </w:r>
       <w:r>
         <w:rPr>
           <w:rFonts w:cs="Arial"/>
@@ -3721,16 +1834,6 @@
           <w:sz w:val="18"/>
           <w:lang w:val="en-US"/>
         </w:rPr>
-        <w:tab/>
-      </w:r>
-      <w:proofErr w:type="gramStart"/>
-      <w:r>
-        <w:rPr>
-          <w:rFonts w:cs="Arial"/>
-          <w:spacing w:val="-3"/>
-          <w:sz w:val="18"/>
-          <w:lang w:val="en-US"/>
-        </w:rPr>
         <w:t xml:space="preserve"/>
       </w:r>
     </w:p>
@@ -3764,16 +1867,6 @@
           <w:sz w:val="18"/>
           <w:lang w:val="en-US"/>
         </w:rPr>
-        <w:tab/>
-      </w:r>
-      <w:proofErr w:type="gramStart"/>
-      <w:r>
-        <w:rPr>
-          <w:rFonts w:cs="Arial"/>
-          <w:spacing w:val="-3"/>
-          <w:sz w:val="18"/>
-          <w:lang w:val="en-US"/>
-        </w:rPr>
         <w:t xml:space="preserve"/>
       </w:r>
     </w:p>
@@ -3800,16 +1893,6 @@
           <w:lang w:val="en-US"/>
         </w:rPr>
       </w:pPr>
-      <w:r>
-        <w:rPr>
-          <w:rFonts w:cs="Arial"/>
-          <w:spacing w:val="-3"/>
-          <w:sz w:val="18"/>
-          <w:lang w:val="en-US"/>
-        </w:rPr>
-        <w:tab/>
-      </w:r>
-      <w:proofErr w:type="gramStart"/>
       <w:r>
         <w:rPr>
           <w:rFonts w:cs="Arial"/>
@@ -3904,7 +1987,7 @@
           <w:sz w:val="28"/>
           <w:szCs w:val="32"/>
         </w:rPr>
-        <w:t xml:space="preserve">AVIS &amp; CONCLUSIONS :</w:t>
+        <w:t>AVIS &amp; CONCLUSIONS :</w:t>
       </w:r>
     </w:p>
     <w:p>
@@ -3936,44 +2019,53 @@
           <w:rFonts w:cs="Arial"/>
           <w:sz w:val="20"/>
         </w:rPr>
-        <w:t>La</w:t>
+        <w:t xml:space="preserve">La zone de Secours remet un </w:t>
       </w:r>
-      <w:proofErr w:type="gramEnd"/>
       <w:r>
         <w:rPr>
           <w:rFonts w:cs="Arial"/>
           <w:sz w:val="20"/>
         </w:rPr>
-        <w:t xml:space="preserve"> zone de Secours remet un rapport de prévention </w:t>
+        <w:t>rapport de prévention</w:t>
+      </w:r>
+      <w:r>
+        <w:rPr>
+          <w:rFonts w:cs="Arial"/>
+          <w:sz w:val="20"/>
+        </w:rPr>
+        <w:t xml:space="preserve"> </w:t>
       </w:r>
       <w:r>
         <w:rPr>
           <w:rFonts w:cs="Arial"/>
           <w:b/>
           <w:sz w:val="20"/>
+          <w:u w:val="single"/>
         </w:rPr>
-        <w:t>FAVORABLE</w:t>
+        <w:t>DEFAVORABLE</w:t>
       </w:r>
       <w:r>
         <w:rPr>
           <w:rFonts w:cs="Arial"/>
           <w:sz w:val="20"/>
         </w:rPr>
-        <w:t xml:space="preserve"> au déroulement de la manifestation pour autant que les prescriptions reprises aux points </w:t>
+        <w:t xml:space="preserve"> au déroulement de la manifestation </w:t>
+      </w:r>
+      <w:r>
+        <w:rPr>
+          <w:rFonts w:cs="Arial"/>
+          <w:b/>
+          <w:sz w:val="20"/>
+          <w:u w:val="single"/>
+        </w:rPr>
+        <w:t xml:space="preserve">compte tenu de l’absence de </w:t>
       </w:r>
       <w:r>
         <w:rPr>
           <w:rFonts w:cs="Arial"/>
           <w:sz w:val="20"/>
         </w:rPr>
-        <w:t xml:space="preserve">cités </w:t>
-      </w:r>
-      <w:r>
-        <w:rPr>
-          <w:rFonts w:cs="Arial"/>
-          <w:sz w:val="20"/>
-        </w:rPr>
-        <w:t xml:space="preserve">ci-dessus soient respectées ; le responsable de l’organisation est tenu de faire respecter les prescriptions durant toute la durée de la manifestation.</w:t>
+        <w:t xml:space="preserve"/>
       </w:r>
     </w:p>
     <w:p>
@@ -3991,64 +2083,7 @@
         <w:rPr>
           <w:rFonts w:cs="Arial"/>
           <w:b/>
-          <w:sz w:val="20"/>
-        </w:rPr>
-      </w:pPr>
-      <w:r>
-        <w:rPr>
-          <w:rFonts w:cs="Arial"/>
-          <w:spacing w:val="-3"/>
-          <w:sz w:val="18"/>
-        </w:rPr>
-        <w:t xml:space="preserve"/>
-      </w:r>
-      <w:r>
-        <w:rPr>
-          <w:rFonts w:cs="Arial"/>
-          <w:sz w:val="20"/>
-        </w:rPr>
-        <w:t xml:space="preserve">Lors</w:t>
-      </w:r>
-      <w:proofErr w:type="gramEnd"/>
-      <w:r>
-        <w:rPr>
-          <w:rFonts w:cs="Arial"/>
-          <w:sz w:val="20"/>
-        </w:rPr>
-        <w:t xml:space="preserve"> de notre visite des installations reprises ci-dessus, nous avons constaté notamment les manquements suivants :</w:t>
-      </w:r>
-      <w:r>
-        <w:rPr>
-          <w:rFonts w:cs="Arial"/>
-          <w:sz w:val="20"/>
-        </w:rPr>
-        <w:t xml:space="preserve"> </w:t>
-      </w:r>
-      <w:proofErr w:type="gramStart"/>
-      <w:r>
-        <w:rPr>
-          <w:rFonts w:cs="Arial"/>
           <w:bCs/>
-          <w:sz w:val="20"/>
-        </w:rPr>
-        <w:t xml:space="preserve">fxj</w:t>
-      </w:r>
-    </w:p>
-    <w:p>
-      <w:pPr>
-        <w:tabs>
-          <w:tab w:val="center" w:pos="4248"/>
-        </w:tabs>
-        <w:suppressAutoHyphens/>
-        <w:overflowPunct w:val="0"/>
-        <w:autoSpaceDE w:val="0"/>
-        <w:autoSpaceDN w:val="0"/>
-        <w:adjustRightInd w:val="0"/>
-        <w:jc w:val="center"/>
-        <w:textAlignment w:val="baseline"/>
-        <w:rPr>
-          <w:rFonts w:ascii="Times New Roman" w:hAnsi="Times New Roman"/>
-          <w:spacing w:val="-3"/>
           <w:sz w:val="20"/>
         </w:rPr>
       </w:pPr>
@@ -4181,14 +2216,13 @@
               </w:rPr>
               <w:t xml:space="preserve">Fait à : </w:t>
             </w:r>
-            <w:proofErr w:type="gramStart"/>
             <w:r>
               <w:rPr>
                 <w:rFonts w:ascii="Technical" w:hAnsi="Technical"/>
                 <w:bCs/>
                 <w:spacing w:val="-3"/>
               </w:rPr>
-              <w:t xml:space="preserve">rr</w:t>
+              <w:t xml:space="preserve"/>
             </w:r>
           </w:p>
           <w:p>
@@ -4213,14 +2247,13 @@
               </w:rPr>
               <w:t xml:space="preserve">Le </w:t>
             </w:r>
-            <w:proofErr w:type="gramStart"/>
             <w:r>
               <w:rPr>
                 <w:rFonts w:ascii="Technical" w:hAnsi="Technical"/>
                 <w:bCs/>
                 <w:spacing w:val="-3"/>
               </w:rPr>
-              <w:t xml:space="preserve">4444-04-04</w:t>
+              <w:t xml:space="preserve"/>
             </w:r>
             <w:r>
               <w:rPr>
@@ -4252,14 +2285,13 @@
                 <w:spacing w:val="-3"/>
               </w:rPr>
             </w:pPr>
-            <w:proofErr w:type="gramStart"/>
             <w:r>
               <w:rPr>
                 <w:rFonts w:ascii="Technical" w:hAnsi="Technical"/>
                 <w:bCs/>
                 <w:spacing w:val="-3"/>
               </w:rPr>
-              <w:t xml:space="preserve">33</w:t>
+              <w:t xml:space="preserve"/>
             </w:r>
             <w:r>
               <w:rPr>
@@ -4292,7 +2324,7 @@
                 <w:bCs/>
                 <w:spacing w:val="-3"/>
               </w:rPr>
-              <w:t xml:space="preserve">Officier technicien en prévention</w:t>
+              <w:t>Officier technicien en prévention</w:t>
             </w:r>
           </w:p>
         </w:tc>
@@ -4316,142 +2348,6 @@
           <w:sz w:val="20"/>
         </w:rPr>
       </w:pPr>
-    </w:p>
-    <w:p>
-      <w:pPr>
-        <w:tabs>
-          <w:tab w:val="left" w:pos="567"/>
-          <w:tab w:val="left" w:pos="6237"/>
-        </w:tabs>
-        <w:suppressAutoHyphens/>
-        <w:overflowPunct w:val="0"/>
-        <w:autoSpaceDE w:val="0"/>
-        <w:autoSpaceDN w:val="0"/>
-        <w:adjustRightInd w:val="0"/>
-        <w:ind w:left="567" w:hanging="567"/>
-        <w:textAlignment w:val="baseline"/>
-        <w:rPr>
-          <w:rFonts w:cs="Arial"/>
-          <w:spacing w:val="-3"/>
-          <w:sz w:val="18"/>
-          <w:szCs w:val="18"/>
-        </w:rPr>
-      </w:pPr>
-      <w:r>
-        <w:rPr>
-          <w:rFonts w:cs="Arial"/>
-          <w:spacing w:val="-3"/>
-          <w:sz w:val="18"/>
-        </w:rPr>
-        <w:t xml:space="preserve"/>
-      </w:r>
-      <w:r>
-        <w:rPr>
-          <w:rFonts w:cs="Arial"/>
-          <w:spacing w:val="-3"/>
-          <w:sz w:val="18"/>
-          <w:szCs w:val="18"/>
-        </w:rPr>
-        <w:sym w:font="Dixieland" w:char="F06D"/>
-      </w:r>
-      <w:r>
-        <w:rPr>
-          <w:rFonts w:cs="Arial"/>
-          <w:spacing w:val="-3"/>
-          <w:sz w:val="18"/>
-          <w:szCs w:val="18"/>
-        </w:rPr>
-        <w:tab/>
-        <w:t xml:space="preserve">Copie transmise ce jour, au responsable de la </w:t>
-      </w:r>
-      <w:proofErr w:type="gramStart"/>
-      <w:r>
-        <w:rPr>
-          <w:rFonts w:cs="Arial"/>
-          <w:spacing w:val="-3"/>
-          <w:sz w:val="18"/>
-          <w:szCs w:val="18"/>
-        </w:rPr>
-        <w:t>manifestation  -</w:t>
-      </w:r>
-      <w:proofErr w:type="gramEnd"/>
-      <w:r>
-        <w:rPr>
-          <w:rFonts w:cs="Arial"/>
-          <w:spacing w:val="-3"/>
-          <w:sz w:val="18"/>
-          <w:szCs w:val="18"/>
-        </w:rPr>
-        <w:t xml:space="preserve">  </w:t>
-      </w:r>
-      <w:r>
-        <w:rPr>
-          <w:rFonts w:cs="Arial"/>
-          <w:spacing w:val="-3"/>
-          <w:sz w:val="18"/>
-          <w:szCs w:val="18"/>
-        </w:rPr>
-        <w:tab/>
-        <w:t xml:space="preserve">- par email</w:t>
-      </w:r>
-    </w:p>
-    <w:p>
-      <w:pPr>
-        <w:tabs>
-          <w:tab w:val="left" w:pos="567"/>
-          <w:tab w:val="left" w:pos="6237"/>
-        </w:tabs>
-        <w:suppressAutoHyphens/>
-        <w:overflowPunct w:val="0"/>
-        <w:autoSpaceDE w:val="0"/>
-        <w:autoSpaceDN w:val="0"/>
-        <w:adjustRightInd w:val="0"/>
-        <w:ind w:left="567" w:hanging="567"/>
-        <w:textAlignment w:val="baseline"/>
-        <w:rPr>
-          <w:rFonts w:cs="Arial"/>
-          <w:spacing w:val="-3"/>
-          <w:sz w:val="18"/>
-          <w:szCs w:val="18"/>
-        </w:rPr>
-      </w:pPr>
-      <w:r>
-        <w:rPr>
-          <w:rFonts w:cs="Arial"/>
-          <w:spacing w:val="-3"/>
-          <w:sz w:val="18"/>
-        </w:rPr>
-        <w:t xml:space="preserve"/>
-      </w:r>
-      <w:r>
-        <w:rPr>
-          <w:rFonts w:cs="Arial"/>
-          <w:spacing w:val="-3"/>
-          <w:sz w:val="18"/>
-          <w:szCs w:val="18"/>
-        </w:rPr>
-        <w:sym w:font="Dixieland" w:char="F06D"/>
-      </w:r>
-      <w:r>
-        <w:rPr>
-          <w:rFonts w:cs="Arial"/>
-          <w:spacing w:val="-3"/>
-          <w:sz w:val="18"/>
-          <w:szCs w:val="18"/>
-        </w:rPr>
-        <w:tab/>
-        <w:t>Copie transmise à la zone de Police</w:t>
-      </w:r>
-      <w:r>
-        <w:rPr>
-          <w:rFonts w:cs="Arial"/>
-          <w:spacing w:val="-3"/>
-          <w:sz w:val="18"/>
-          <w:szCs w:val="18"/>
-        </w:rPr>
-        <w:tab/>
-        <w:t xml:space="preserve">- par télécopie</w:t>
-      </w:r>
     </w:p>
     <w:p>
       <w:pPr>
@@ -4592,12 +2488,6 @@
                                 <w:sz w:val="20"/>
                               </w:rPr>
                               <w:t>Zone de secours du Brabant wallon – Parc des Collines - Bâtiment Newton</w:t>
-                            </w:r>
-                            <w:r>
-                              <w:rPr>
-                                <w:sz w:val="20"/>
-                              </w:rPr>
-                              <w:tab/>
                             </w:r>
                           </w:p>
                           <w:p>
@@ -4798,12 +2688,6 @@
                           <w:sz w:val="20"/>
                         </w:rPr>
                         <w:t>Zone de secours du Brabant wallon – Parc des Collines - Bâtiment Newton</w:t>
-                      </w:r>
-                      <w:r>
-                        <w:rPr>
-                          <w:sz w:val="20"/>
-                        </w:rPr>
-                        <w:tab/>
                       </w:r>
                     </w:p>
                     <w:p>

</xml_diff>